<commit_message>
docs: apply decision in PR #80
</commit_message>
<xml_diff>
--- a/regulamin/Regulamin-powolywania-Reprezentacji-Polski-Weteranow-w-szermierce_2026.docx
+++ b/regulamin/Regulamin-powolywania-Reprezentacji-Polski-Weteranow-w-szermierce_2026.docx
@@ -2226,7 +2226,18 @@
         <w:t xml:space="preserve">7) </w:t>
       </w:r>
       <w:r>
-        <w:t>protokoły i wyniki, o których mowa w pkt 6 powyżej, pozostają dostępne online przez co najmniej 36 miesięcy od dnia zakończenia zawodów.</w:t>
+        <w:t>protokoły i wyniki, o których mowa w pkt 6 powyżej, pozostają dostępne online przez co najmniej 36 miesięcy od dnia zakończenia zawodów;</w:t>
+      </w:r>
+    </w:p>
+    <w:p>
+      <w:pPr>
+        <w:ind w:left="595" w:hanging="255"/>
+      </w:pPr>
+      <w:r>
+        <w:t xml:space="preserve">8) </w:t>
+      </w:r>
+      <w:r>
+        <w:t>od ćwierć finałów, walki eliminacji bezpośredniej są prowadzone przez licencjonowanych sędziów PZSz.</w:t>
       </w:r>
     </w:p>
     <w:p>

</xml_diff>

<commit_message>
docs: align representation ranking with domestic competition
</commit_message>
<xml_diff>
--- a/regulamin/Regulamin-powolywania-Reprezentacji-Polski-Weteranow-w-szermierce_2026.docx
+++ b/regulamin/Regulamin-powolywania-Reprezentacji-Polski-Weteranow-w-szermierce_2026.docx
@@ -459,7 +459,7 @@
             <w:rStyle w:val="Hyperlink"/>
             <w:noProof/>
           </w:rPr>
-          <w:t>Ranking indywidualny</w:t>
+          <w:t>Ranking wyłaniania reprezentacji</w:t>
         </w:r>
         <w:r>
           <w:rPr>
@@ -1139,7 +1139,7 @@
                 <w:b/>
                 <w:sz w:val="18"/>
               </w:rPr>
-              <w:t>Ranking indywidualny</w:t>
+              <w:t>Ranking wyłaniania reprezentacji</w:t>
             </w:r>
           </w:p>
         </w:tc>
@@ -1163,7 +1163,7 @@
                 <w:color w:val="667386"/>
                 <w:sz w:val="18"/>
               </w:rPr>
-              <w:t>rola rankingu, zawody, punktacja i warunki ujęcia wyników</w:t>
+              <w:t>rola Rankingu, zawody, punktacja i warunki ujęcia wyników</w:t>
             </w:r>
           </w:p>
         </w:tc>
@@ -1718,10 +1718,10 @@
         <w:rPr>
           <w:b/>
         </w:rPr>
-        <w:t>rankingu hybrydowym</w:t>
+        <w:t>Rankingu</w:t>
       </w:r>
       <w:r>
-        <w:t xml:space="preserve"> – należy przez to rozumieć ranking indywidualny, w którym wyniki są aktualizowane z zastosowaniem aktualizacji krokowej albo wygaszania kalendarzowego, zależnie od organizatora i rodzaju zawodów;</w:t>
+        <w:t xml:space="preserve"> – należy przez to rozumieć Ranking wyłaniania Reprezentacji Polski Weteranów, prowadzony osobno dla każdej broni, płci i kategorii wiekowej;</w:t>
       </w:r>
     </w:p>
     <w:p>
@@ -1735,10 +1735,10 @@
         <w:rPr>
           <w:b/>
         </w:rPr>
-        <w:t>aktualizacji krokowej</w:t>
+        <w:t>rankingu hybrydowym</w:t>
       </w:r>
       <w:r>
-        <w:t xml:space="preserve"> – należy przez to rozumieć sposób aktualizacji wyników zawodów organizowanych przez SPWS, PZSz lub FIE, zgodnie z którym punkty za zawody z poprzedniego sezonu pozostają w rankingu do czasu uwzględnienia punktów za odpowiadające im zawody w sezonie bieżącym, po czym poprzedni wynik przestaje być uwzględniany;</w:t>
+        <w:t xml:space="preserve"> – należy przez to rozumieć Ranking, w którym wyniki są aktualizowane z zastosowaniem aktualizacji krokowej albo wygaszania kalendarzowego, zależnie od organizatora i rodzaju zawodów;</w:t>
       </w:r>
     </w:p>
     <w:p>
@@ -1752,10 +1752,10 @@
         <w:rPr>
           <w:b/>
         </w:rPr>
-        <w:t>wygaszaniu kalendarzowym</w:t>
+        <w:t>aktualizacji krokowej</w:t>
       </w:r>
       <w:r>
-        <w:t xml:space="preserve"> – należy przez to rozumieć sposób uwzględniania wyników zawodów organizowanych przez EVF, zgodnie z którym uzyskane punkty pozostają w rankingu przez okres właściwy dla danego rodzaju zawodów, liczony od dnia zakończenia zawodów, niezależnie od tego, czy zawody mają odpowiednik w kolejnym sezonie, a po upływie tego okresu przestają być uwzględniane;</w:t>
+        <w:t xml:space="preserve"> – należy przez to rozumieć sposób aktualizacji wyników zawodów organizowanych przez SPWS, PZSz lub FIE, zgodnie z którym punkty za zawody z poprzedniego sezonu pozostają w Rankingu do czasu uwzględnienia punktów za odpowiadające im zawody w sezonie bieżącym, po czym poprzedni wynik przestaje być uwzględniany;</w:t>
       </w:r>
     </w:p>
     <w:p>
@@ -1764,6 +1764,23 @@
       </w:pPr>
       <w:r>
         <w:t xml:space="preserve">8) </w:t>
+      </w:r>
+      <w:r>
+        <w:rPr>
+          <w:b/>
+        </w:rPr>
+        <w:t>wygaszaniu kalendarzowym</w:t>
+      </w:r>
+      <w:r>
+        <w:t xml:space="preserve"> – należy przez to rozumieć sposób uwzględniania wyników zawodów organizowanych przez EVF, zgodnie z którym uzyskane punkty pozostają w Rankingu przez okres właściwy dla danego rodzaju zawodów, liczony od dnia zakończenia zawodów, niezależnie od tego, czy zawody mają odpowiednik w kolejnym sezonie, a po upływie tego okresu przestają być uwzględniane;</w:t>
+      </w:r>
+    </w:p>
+    <w:p>
+      <w:pPr>
+        <w:ind w:left="595" w:hanging="255"/>
+      </w:pPr>
+      <w:r>
+        <w:t xml:space="preserve">9) </w:t>
       </w:r>
       <w:r>
         <w:rPr>
@@ -1780,7 +1797,7 @@
         <w:ind w:left="595" w:hanging="255"/>
       </w:pPr>
       <w:r>
-        <w:t xml:space="preserve">9) </w:t>
+        <w:t xml:space="preserve">10) </w:t>
       </w:r>
       <w:r>
         <w:rPr>
@@ -1797,7 +1814,35 @@
         <w:ind w:left="595" w:hanging="255"/>
       </w:pPr>
       <w:r>
-        <w:t xml:space="preserve">10) </w:t>
+        <w:t xml:space="preserve">11) </w:t>
+      </w:r>
+      <w:r>
+        <w:rPr>
+          <w:b/>
+        </w:rPr>
+        <w:t>kategorii V0</w:t>
+      </w:r>
+      <w:r>
+        <w:t xml:space="preserve"> – należy przez to rozumieć krajową kategorię zawodników w wieku od 30 do 39 lat, która nie występuje w klasyfikacjach EVF ani FIE:</w:t>
+      </w:r>
+    </w:p>
+    <w:p>
+      <w:pPr>
+        <w:ind w:left="879" w:hanging="255"/>
+      </w:pPr>
+      <w:r>
+        <w:t xml:space="preserve">a) </w:t>
+      </w:r>
+      <w:r>
+        <w:t>V0 – od 30 do 39 lat.</w:t>
+      </w:r>
+    </w:p>
+    <w:p>
+      <w:pPr>
+        <w:ind w:left="595" w:hanging="255"/>
+      </w:pPr>
+      <w:r>
+        <w:t xml:space="preserve">12) </w:t>
       </w:r>
       <w:r>
         <w:rPr>
@@ -1909,7 +1954,7 @@
         <w:t>szerokiego wyboru zawodów</w:t>
       </w:r>
       <w:r>
-        <w:t xml:space="preserve"> – w rankingu indywidualnym uwzględnia się wyniki uzyskane w zawodach ujętych w kalendarzach SPWS, PZSz, EVF i FIE, na zasadach określonych w § 5 ust. 1 lub zgłoszonych do kalendarza PZSz;</w:t>
+        <w:t xml:space="preserve"> – w Rankingu uwzględnia się wyniki uzyskane w zawodach ujętych w kalendarzach SPWS, PZSz, EVF i FIE, z zastrzeżeniem odrębnych zasad dla kategorii V0, na zasadach określonych w § 5 ust. 1 lub zgłoszonych do kalendarza PZSz;</w:t>
       </w:r>
     </w:p>
     <w:p>
@@ -1923,10 +1968,10 @@
         <w:rPr>
           <w:b/>
         </w:rPr>
-        <w:t>powołania do startów indywidualnych wyłącznie na podstawie rankingu</w:t>
+        <w:t>powołania do startów indywidualnych wyłącznie na podstawie Rankingu</w:t>
       </w:r>
       <w:r>
-        <w:t xml:space="preserve"> – do startu indywidualnego powołuje się czterech najwyżej sklasyfikowanych zawodników w rankingu właściwym dla danej broni, płci i kategorii wiekowej. Zawodnik z zerowym dorobkiem punktowym nie może zostać powołany do reprezentacji. Wyjątek stanowi powołanie uzupełniające, o którym mowa w § 4 ust. 5.</w:t>
+        <w:t xml:space="preserve"> – do startu indywidualnego powołuje się czterech najwyżej sklasyfikowanych zawodników kategorii V1–V4 w Rankingu właściwym dla danej broni, płci i kategorii wiekowej. Zawodnik z zerowym dorobkiem punktowym nie może zostać powołany do reprezentacji. Wyjątek stanowi powołanie uzupełniające, o którym mowa w § 4 ust. 5.</w:t>
       </w:r>
     </w:p>
     <w:p>
@@ -1945,7 +1990,7 @@
         <w:jc w:val="center"/>
       </w:pPr>
       <w:r>
-        <w:t>Ranking indywidualny</w:t>
+        <w:t>Ranking wyłaniania reprezentacji</w:t>
       </w:r>
       <w:bookmarkEnd w:id="239877509"/>
     </w:p>
@@ -1964,7 +2009,7 @@
         <w:keepNext/>
       </w:pPr>
       <w:r>
-        <w:t>Rola rankingu indywidualnego</w:t>
+        <w:t>Rola Rankingu</w:t>
       </w:r>
     </w:p>
     <w:p>
@@ -1976,7 +2021,7 @@
         <w:t xml:space="preserve">1. </w:t>
       </w:r>
       <w:r>
-        <w:t>Ranking indywidualny stanowi podstawę kwalifikowania zawodników do startów indywidualnych oraz wyłonienia puli kandydatów do składu drużyny.</w:t>
+        <w:t>Ranking w kategoriach V1–V4 stanowi podstawę kwalifikowania zawodników do startów indywidualnych oraz wyłonienia puli kandydatów do składu drużyny.</w:t>
       </w:r>
     </w:p>
     <w:p>
@@ -1987,7 +2032,7 @@
         <w:t xml:space="preserve">2. </w:t>
       </w:r>
       <w:r>
-        <w:t>Ranking indywidualny wyznacza pulę kandydatów do drużyny oraz zapewnia miejsce w jej składzie najwyżej sklasyfikowanemu zawodnikowi z każdej z dwóch kategorii wiekowych objętych daną kategorią drużynową. Pozostałych zawodników drużyny, a w przypadku Drużynowych Mistrzostw Europy także zawodnika rezerwowego, wybiera zespół pełniący funkcję selekcjonera, na zasadach określonych w rozdziale 4.</w:t>
+        <w:t>Ranking w kategoriach V1–V4 wyznacza pulę kandydatów do drużyny oraz zapewnia miejsce w jej składzie najwyżej sklasyfikowanemu zawodnikowi z każdej z dwóch kategorii wiekowych objętych daną kategorią drużynową. Pozostałych zawodników drużyny, a w przypadku Drużynowych Mistrzostw Europy także zawodnika rezerwowego, wybiera zespół pełniący funkcję selekcjonera, na zasadach określonych w rozdziale 4.</w:t>
       </w:r>
     </w:p>
     <w:p>
@@ -1998,7 +2043,7 @@
         <w:t xml:space="preserve">3. </w:t>
       </w:r>
       <w:r>
-        <w:t>Zawodnik samodzielnie wybiera zawody, w których bierze udział. Warunkiem uwzględnienia go w rankingu indywidualnym jest co najmniej jeden start w Pucharze Polski Weteranów w Szermierce albo Mistrzostwach Polski Weteranów w Szermierce.</w:t>
+        <w:t>Zawodnik samodzielnie wybiera zawody, w których bierze udział. Warunkiem uwzględnienia go w Rankingu jest co najmniej jeden start w Pucharze Polski Weteranów w Szermierce albo Mistrzostwach Polski Weteranów w Szermierce.</w:t>
       </w:r>
     </w:p>
     <w:p>
@@ -2009,7 +2054,7 @@
         <w:t xml:space="preserve">4. </w:t>
       </w:r>
       <w:r>
-        <w:t>Z zastrzeżeniem ust. 5 poniżej, do reprezentacji Polski na limitowane zawody międzynarodowe może zostać powołany wyłącznie zawodnik, który wystartował w co najmniej jednych zawodach uwzględnianych w rankingu indywidualnym i uzyskał w nim dorobek większy niż zero punktów.</w:t>
+        <w:t>Z zastrzeżeniem ust. 5 poniżej, do reprezentacji Polski na limitowane zawody międzynarodowe może zostać powołany wyłącznie zawodnik kategorii V1–V4, który wystartował w co najmniej jednych zawodach uwzględnianych w Rankingu i uzyskał w nim dorobek większy niż zero punktów. Pozycje kategorii V0 nie stanowią podstawy powołania do reprezentacji.</w:t>
       </w:r>
     </w:p>
     <w:p>
@@ -2094,7 +2139,7 @@
         <w:t xml:space="preserve">1. </w:t>
       </w:r>
       <w:r>
-        <w:t>W sezonie 2026/2027 w rankingu indywidualnym uwzględnia się wyniki uzyskane w następujących cyklach i zawodach:</w:t>
+        <w:t>W sezonie 2026/2027 w Rankingu uwzględnia się wyniki uzyskane w następujących cyklach i zawodach, z zastrzeżeniem ust. 8 poniżej:</w:t>
       </w:r>
     </w:p>
     <w:p>
@@ -2248,7 +2293,7 @@
         <w:t xml:space="preserve">3. </w:t>
       </w:r>
       <w:r>
-        <w:t>Łączna liczba punktów zawodnika w rankingu indywidualnym jest sumą punktów przypisanych do ośmiu pozycji wynikowych:</w:t>
+        <w:t>Łączna liczba punktów zawodnika w Rankingu jest sumą punktów przypisanych do ośmiu pozycji wynikowych:</w:t>
       </w:r>
     </w:p>
     <w:p>
@@ -2292,7 +2337,7 @@
         <w:t xml:space="preserve">1) </w:t>
       </w:r>
       <w:r>
-        <w:t>spośród wszystkich wyników uzyskanych przez zawodnika w tych zawodach wybiera się trzy wyniki, za które zawodnik otrzymał najwyższą liczbę punktów rankingowych;</w:t>
+        <w:t>dwie pozycje wypełniają dwa najlepsze wyniki punktowe zawodnika uzyskane w PPW;</w:t>
       </w:r>
     </w:p>
     <w:p>
@@ -2303,7 +2348,29 @@
         <w:t xml:space="preserve">2) </w:t>
       </w:r>
       <w:r>
-        <w:t>jeżeli zawodnik uzyskał mniej niż trzy wyniki w Pucharze Polski Weteranów w Szermierce lub Mistrzostwach Polski Weteranów w Szermierce, za każdą niewypełnioną obowiązkową pozycję krajową przyjmuje się zero punktów rankingowych.</w:t>
+        <w:t>trzecią pozycję wypełnia wynik punktowy uzyskany w MPW;</w:t>
+      </w:r>
+    </w:p>
+    <w:p>
+      <w:pPr>
+        <w:ind w:left="595" w:hanging="255"/>
+      </w:pPr>
+      <w:r>
+        <w:t xml:space="preserve">3) </w:t>
+      </w:r>
+      <w:r>
+        <w:t>jeżeli zawodnik uzyskał mniej niż dwa wyniki w PPW, za każdą niewypełnioną pozycję PPW przyjmuje się 0 punktów;</w:t>
+      </w:r>
+    </w:p>
+    <w:p>
+      <w:pPr>
+        <w:ind w:left="595" w:hanging="255"/>
+      </w:pPr>
+      <w:r>
+        <w:t xml:space="preserve">4) </w:t>
+      </w:r>
+      <w:r>
+        <w:t>jeżeli zawodnik nie wystartował w MPW, za obowiązkową pozycję MPW przyjmuje się 0 punktów; brak startu w MPW nie powoduje usunięcia zawodnika z Rankingu.</w:t>
       </w:r>
     </w:p>
     <w:p>
@@ -2314,7 +2381,7 @@
         <w:t xml:space="preserve">5. </w:t>
       </w:r>
       <w:r>
-        <w:t>Na pięć pozycji otwartych składa się pięć najwyżej punktowanych spośród pozostałych wyników zawodnika uwzględnianych w rankingu.</w:t>
+        <w:t>Na pięć pozycji otwartych składa się pięć najwyżej punktowanych spośród pozostałych wyników zawodnika uwzględnianych w Rankingu.</w:t>
       </w:r>
     </w:p>
     <w:p>
@@ -2337,6 +2404,17 @@
       </w:r>
       <w:r>
         <w:t>Żaden wynik nie może zostać policzony dwukrotnie.</w:t>
+      </w:r>
+    </w:p>
+    <w:p>
+      <w:pPr>
+        <w:ind w:left="312" w:hanging="227"/>
+      </w:pPr>
+      <w:r>
+        <w:t xml:space="preserve">8. </w:t>
+      </w:r>
+      <w:r>
+        <w:t>W kategorii V0 w Rankingu uwzględnia się wyłącznie punkty z PPW, MPW, PPS i MPS; nie uwzględnia się punktów z zawodów EVF ani FIE. Kategorie V1–V4 prowadzi się na zasadach określonych w ust. 1–7.</w:t>
       </w:r>
     </w:p>
     <w:p>
@@ -3036,7 +3114,15 @@
         <w:ind w:left="85"/>
       </w:pPr>
       <w:r>
-        <w:t>Ranking indywidualny oraz kalkulator punktów są publikowane na stronie internetowej.</w:t>
+        <w:t>Ranking oraz kalkulator punktów są publikowane na stronie internetowej.</w:t>
+      </w:r>
+    </w:p>
+    <w:p>
+      <w:pPr>
+        <w:ind w:left="85"/>
+      </w:pPr>
+      <w:r>
+        <w:t>Klasyfikacja Pucharu Polski Weteranów jest filtrowanym podzbiorem Rankingu, a nie odrębnym systemem rankingowym. Otrzymuje się ją przez zastosowanie w systemie online filtra obejmującego PPW i MPW; pokazuje ona sumę dwóch najlepszych pozycji PPW i obowiązkowej pozycji MPW.</w:t>
       </w:r>
     </w:p>
     <w:p>
@@ -3179,7 +3265,7 @@
         <w:t xml:space="preserve">1. </w:t>
       </w:r>
       <w:r>
-        <w:t>W rankingu indywidualnym uwzględnia się wyłącznie weteranów szermierki, którzy co najmniej raz wystartowali w zawodach Pucharu Polski Weteranów w Szermierce albo Mistrzostwach Polski Weteranów w Szermierce.</w:t>
+        <w:t>W Rankingu uwzględnia się wyłącznie weteranów szermierki, którzy co najmniej raz wystartowali w zawodach Pucharu Polski Weteranów w Szermierce albo Mistrzostwach Polski Weteranów w Szermierce.</w:t>
       </w:r>
     </w:p>
     <w:p>
@@ -3248,7 +3334,7 @@
         <w:ind w:left="85"/>
       </w:pPr>
       <w:r>
-        <w:t>Do startu indywidualnego w limitowanych zawodach międzynarodowych powołuje się czterech najwyżej sklasyfikowanych zawodników w rankingu właściwym dla danej broni, płci i kategorii wiekowej, z uwzględnieniem warunku dodatniego dorobku punktowego określonego w § 4 ust. 4.</w:t>
+        <w:t>Do startu indywidualnego w limitowanych zawodach międzynarodowych powołuje się czterech najwyżej sklasyfikowanych zawodników kategorii V1–V4 w Rankingu właściwym dla danej broni, płci i kategorii wiekowej, z uwzględnieniem warunku dodatniego dorobku punktowego określonego w § 4 ust. 4.</w:t>
       </w:r>
     </w:p>
     <w:p>
@@ -3275,7 +3361,7 @@
         <w:ind w:left="85"/>
       </w:pPr>
       <w:r>
-        <w:t>W przypadku rezygnacji zawodnika z udziału w zawodach indywidualnych jego miejsce przechodzi na kolejnego zawodnika zgodnie z aktualnym rankingiem indywidualnym.</w:t>
+        <w:t>W przypadku rezygnacji zawodnika z udziału w zawodach indywidualnych jego miejsce przechodzi na kolejnego zawodnika zgodnie z aktualnym Rankingiem.</w:t>
       </w:r>
     </w:p>
     <w:p>
@@ -3325,7 +3411,7 @@
         <w:t xml:space="preserve">1. </w:t>
       </w:r>
       <w:r>
-        <w:t>Ranking indywidualny weteranów przyjęty dla danego cyklu powołań wyznacza pulę kandydatów do drużyny właściwą dla danej broni, płci i kategorii drużynowej. Na Mistrzostwa Świata pula obejmuje po czterech zawodników z każdej z dwóch kategorii wiekowych, a na Mistrzostwa Europy — po sześciu.</w:t>
+        <w:t>Ranking przyjęty dla danego cyklu powołań wyznacza pulę kandydatów do drużyny właściwą dla danej broni, płci i kategorii drużynowej. Na Mistrzostwa Świata pula obejmuje po czterech zawodników z każdej z dwóch kategorii wiekowych, a na Mistrzostwa Europy — po sześciu.</w:t>
       </w:r>
     </w:p>
     <w:p>
@@ -3336,7 +3422,7 @@
         <w:t xml:space="preserve">2. </w:t>
       </w:r>
       <w:r>
-        <w:t>W przypadku rezygnacji zawodnika z udziału w puli kandydatów jego miejsce zajmuje kolejny zawodnik w rankingu indywidualnym jego kategorii wiekowej.</w:t>
+        <w:t>W przypadku rezygnacji zawodnika z udziału w puli kandydatów jego miejsce zajmuje kolejny zawodnik w Rankingu jego kategorii wiekowej.</w:t>
       </w:r>
     </w:p>
     <w:p>
@@ -3404,7 +3490,7 @@
         <w:t xml:space="preserve">1. </w:t>
       </w:r>
       <w:r>
-        <w:t>Pulę kandydatów do drużyny tworzy ośmiu zawodników nominowanych do startu indywidualnego: po czterech zawodników z każdej z dwóch kategorii wiekowych objętych daną kategorią drużynową. Podstawą wyłonienia puli jest ranking indywidualny weteranów przyjęty dla danego cyklu powołań.</w:t>
+        <w:t>Pulę kandydatów do drużyny tworzy ośmiu zawodników nominowanych do startu indywidualnego: po czterech zawodników z każdej z dwóch kategorii wiekowych objętych daną kategorią drużynową. Podstawą wyłonienia puli jest Ranking przyjęty dla danego cyklu powołań.</w:t>
       </w:r>
     </w:p>
     <w:p>
@@ -3415,7 +3501,7 @@
         <w:t xml:space="preserve">2. </w:t>
       </w:r>
       <w:r>
-        <w:t>Najwyżej sklasyfikowany w tym rankingu zawodnik młodszej kategorii wiekowej oraz najwyżej sklasyfikowany zawodnik starszej kategorii wiekowej spośród zawodników należących do puli mają zapewnione miejsca w drużynie. Wyniki turnieju indywidualnego Mistrzostw Świata nie zmieniają tego uprawnienia.</w:t>
+        <w:t>Najwyżej sklasyfikowany w tym Rankingu zawodnik młodszej kategorii wiekowej oraz najwyżej sklasyfikowany zawodnik starszej kategorii wiekowej spośród zawodników należących do puli mają zapewnione miejsca w drużynie. Wyniki turnieju indywidualnego Mistrzostw Świata nie zmieniają tego uprawnienia.</w:t>
       </w:r>
     </w:p>
     <w:p>
@@ -3489,7 +3575,7 @@
         <w:t xml:space="preserve">1. </w:t>
       </w:r>
       <w:r>
-        <w:t>Pulę kandydatów do drużyny tworzy dwunastu zawodników: sześciu najwyżej sklasyfikowanych zawodników młodszej kategorii wiekowej oraz sześciu najwyżej sklasyfikowanych zawodników starszej kategorii wiekowej w rankingu indywidualnym weteranów właściwym dla danej broni i płci, przyjętym dla danego cyklu powołań.</w:t>
+        <w:t>Pulę kandydatów do drużyny tworzy dwunastu zawodników: sześciu najwyżej sklasyfikowanych zawodników młodszej kategorii wiekowej oraz sześciu najwyżej sklasyfikowanych zawodników starszej kategorii wiekowej w Rankingu właściwym dla danej broni i płci, przyjętym dla danego cyklu powołań.</w:t>
       </w:r>
     </w:p>
     <w:p>
@@ -3522,7 +3608,7 @@
         <w:t xml:space="preserve">4. </w:t>
       </w:r>
       <w:r>
-        <w:t>Zespół ustala skład w drodze porozumienia, kierując się celem wystawienia możliwie najsilniejszej drużyny, osiągnięciami kandydatów w startach indywidualnych i drużynowych oraz wymaganiami dotyczącymi kategorii wiekowych. Miejsce w rankingu indywidualnym nie przesądza o wyborze pozostałych zawodników do drużyny.</w:t>
+        <w:t>Zespół ustala skład w drodze porozumienia, kierując się celem wystawienia możliwie najsilniejszej drużyny, osiągnięciami kandydatów w startach indywidualnych i drużynowych oraz wymaganiami dotyczącymi kategorii wiekowych. Miejsce w Rankingu nie przesądza o wyborze pozostałych zawodników do drużyny.</w:t>
       </w:r>
     </w:p>
     <w:p>
@@ -3764,7 +3850,7 @@
         <w:t xml:space="preserve">13. </w:t>
       </w:r>
       <w:r>
-        <w:t>SPWS wykorzystuje oficjalne wyniki i protokoły zawodów uwzględnianych w rankingu: PPW i MPW, zawodów PZSz, EVF oraz FIE. Każdy wynik ujęty w karcie zawodnika zawiera odnośnik do publicznego protokołu stanowiącego jego źródło.</w:t>
+        <w:t>SPWS wykorzystuje oficjalne wyniki i protokoły zawodów uwzględnianych w Rankingu: PPW i MPW, zawodów PZSz, EVF oraz FIE. Każdy wynik ujęty w karcie zawodnika zawiera odnośnik do publicznego protokołu stanowiącego jego źródło.</w:t>
       </w:r>
     </w:p>
     <w:p>

</xml_diff>